<commit_message>
fix(cv): Astra-Review a0d5b8c - EN geglaettet, Beschriftungen Poppler-fest
- Beschriftung in Inhaltsschrift: Poppler-pdftotext stellte die erste Beschriftung
  je Block hinter den Block; jetzt 12/12 Paare mit xpdf 4.00 und Poppler 26.02
- EN: experience includes, define/verify requirements, mutation test, cold outreach,
  personal project, job application management u. a.
- Berufserfahrung DE/EN: Shopify-Themes angepasst, nicht auf eigenen Servern betrieben
</commit_message>
<xml_diff>
--- a/ats-cv/Jason_Roschmann_CV_ATS_EN.docx
+++ b/ats-cv/Jason_Roschmann_CV_ATS_EN.docx
@@ -69,7 +69,7 @@
         <w:pStyle w:val="FirstParagraph"/>
       </w:pPr>
       <w:r>
-        <w:t xml:space="preserve">I build AI automations and web applications with Python and TypeScript, on my own and in a team. My practice covers API integration, background jobs and targeted tests against duplicate actions and data loss. I use AI agents for implementation; I own the requirements and the acceptance of my contributions. I am looking for a junior role in AI automation or backend/full-stack development.</w:t>
+        <w:t xml:space="preserve">I build AI automations and web applications with Python and TypeScript, on my own and in a team. My experience includes API integration, background jobs and targeted tests against duplicate actions and data loss. I use AI agents for implementation; I define the requirements for my contributions and verify that they are met. I am looking for a junior role in AI automation or backend/full-stack development.</w:t>
       </w:r>
     </w:p>
     <w:bookmarkEnd w:id="9"/>
@@ -178,7 +178,7 @@
         </w:numPr>
       </w:pPr>
       <w:r>
-        <w:t xml:space="preserve">Fix: handle closed, security rule kept, test corrected. Separately, as its own contribution: fixed silent data loss in the task store, with five new tests.</w:t>
+        <w:t xml:space="preserve">Fix: handle closed, security rule kept, test corrected. In a separate contribution, I fixed silent data loss in the task store and added five tests.</w:t>
       </w:r>
     </w:p>
     <w:p>
@@ -190,7 +190,7 @@
         </w:numPr>
       </w:pPr>
       <w:r>
-        <w:t xml:space="preserve">Evidence: mutation probe — deliberately weakening the security rule made the corrected test fail. Test suite from 177 to 199 passing tests.</w:t>
+        <w:t xml:space="preserve">Evidence: mutation test — deliberately weakening the security rule made the corrected test fail. Test suite from 177 to 199 passing tests.</w:t>
       </w:r>
     </w:p>
     <w:p>
@@ -202,17 +202,17 @@
         </w:numPr>
       </w:pPr>
       <w:r>
-        <w:t xml:space="preserve">How I work with AI agents: every bug first as a failing test, the agent implements, a second model reviews as an additional reviewer, rollout with checksums and automatic rollback.</w:t>
+        <w:t xml:space="preserve">How I work with AI agents: every bug first as a failing test, the agent implements, a second model provides an additional review, rollout with checksums and automatic rollback.</w:t>
       </w:r>
     </w:p>
     <w:bookmarkEnd w:id="11"/>
-    <w:bookmarkStart w:id="12" w:name="X4613ea068d5b3d01c1c35f68672d9804c688a67"/>
+    <w:bookmarkStart w:id="12" w:name="Xa24f75b7c41d1b721c4b7f3e671010301f5c2d3"/>
     <w:p>
       <w:pPr>
         <w:pStyle w:val="Heading3"/>
       </w:pPr>
       <w:r>
-        <w:t xml:space="preserve">AI-assisted application management (own project, since July 2026)</w:t>
+        <w:t xml:space="preserve">AI-assisted job application management (personal project, since July 2026)</w:t>
       </w:r>
     </w:p>
     <w:p>
@@ -335,7 +335,7 @@
         </w:numPr>
       </w:pPr>
       <w:r>
-        <w:t xml:space="preserve">Performance: versioned assets, loading fallback, performance passes against jank (nk247store.de).</w:t>
+        <w:t xml:space="preserve">Performance: versioned assets, loading fallback, performance tuning to address stuttering (nk247store.de).</w:t>
       </w:r>
     </w:p>
     <w:p>
@@ -460,7 +460,7 @@
         </w:numPr>
       </w:pPr>
       <w:r>
-        <w:t xml:space="preserve">Developed, tested and operated Python backends, Next.js frontends and Shopify themes on Linux servers (Docker Compose, cron, deployment with rollback); team work via branches, pull requests and shared test suites.</w:t>
+        <w:t xml:space="preserve">Developed and tested Python backends and Next.js frontends and ran them on Linux servers (Docker Compose, cron, deployment with rollback); customised Shopify themes; team work via branches, pull requests and shared test suites.</w:t>
       </w:r>
     </w:p>
     <w:bookmarkEnd w:id="16"/>
@@ -494,7 +494,7 @@
         </w:numPr>
       </w:pPr>
       <w:r>
-        <w:t xml:space="preserve">Cold acquisition and needs assessment directly with owners and managing directors, negotiation and closing on site.</w:t>
+        <w:t xml:space="preserve">Cold outreach and needs assessment directly with owners and managing directors, negotiation and closing on site.</w:t>
       </w:r>
     </w:p>
     <w:p>

</xml_diff>

<commit_message>
feat(cv): Entwickler-CV EN v4 - Co-founder FlowKI Club, Flowki Studio as a product (Astra-GO)
</commit_message>
<xml_diff>
--- a/ats-cv/Jason_Roschmann_CV_ATS_EN.docx
+++ b/ats-cv/Jason_Roschmann_CV_ATS_EN.docx
@@ -2,7 +2,7 @@
 <file path=word/document.xml><?xml version="1.0" encoding="utf-8"?>
 <w:document xmlns:w="http://schemas.openxmlformats.org/wordprocessingml/2006/main" xmlns:m="http://schemas.openxmlformats.org/officeDocument/2006/math" xmlns:r="http://schemas.openxmlformats.org/officeDocument/2006/relationships" xmlns:o="urn:schemas-microsoft-com:office:office" xmlns:v="urn:schemas-microsoft-com:vml" xmlns:w10="urn:schemas-microsoft-com:office:word" xmlns:a="http://schemas.openxmlformats.org/drawingml/2006/main" xmlns:pic="http://schemas.openxmlformats.org/drawingml/2006/picture" xmlns:wp="http://schemas.openxmlformats.org/drawingml/2006/wordprocessingDrawing">
   <w:body>
-    <w:bookmarkStart w:id="23" w:name="jason-roschmann"/>
+    <w:bookmarkStart w:id="22" w:name="jason-roschmann"/>
     <w:p>
       <w:pPr>
         <w:pStyle w:val="Heading1"/>
@@ -16,7 +16,7 @@
         <w:pStyle w:val="FirstParagraph"/>
       </w:pPr>
       <w:r>
-        <w:t xml:space="preserve">Junior Software Engineer · AI Automation</w:t>
+        <w:t xml:space="preserve">Junior Software Engineer · Python · TypeScript · AI automation</w:t>
       </w:r>
     </w:p>
     <w:p>
@@ -24,7 +24,36 @@
         <w:pStyle w:val="BodyText"/>
       </w:pPr>
       <w:r>
-        <w:t xml:space="preserve">I build AI automations – and make their behaviour verifiable.</w:t>
+        <w:t xml:space="preserve">Email: jason@roschmann-digital.de | Phone: +49 155 612 953 91</w:t>
+      </w:r>
+      <w:r>
+        <w:br/>
+      </w:r>
+      <w:r>
+        <w:t xml:space="preserve">LinkedIn: linkedin.com/in/jason-roschmann-1091512b2 | GitHub: github.com/JasonRoschmann | Web CV: jasonroschmann.github.io/cv</w:t>
+      </w:r>
+      <w:r>
+        <w:br/>
+      </w:r>
+      <w:r>
+        <w:t xml:space="preserve">Location: Hamburg, Germany | Looking for: Hamburg or remote; relocation to Zurich possible for the right role | Start date by arrangement</w:t>
+      </w:r>
+    </w:p>
+    <w:bookmarkStart w:id="9" w:name="profile"/>
+    <w:p>
+      <w:pPr>
+        <w:pStyle w:val="Heading2"/>
+      </w:pPr>
+      <w:r>
+        <w:t xml:space="preserve">Profile</w:t>
+      </w:r>
+    </w:p>
+    <w:p>
+      <w:pPr>
+        <w:pStyle w:val="FirstParagraph"/>
+      </w:pPr>
+      <w:r>
+        <w:t xml:space="preserve">I build web interfaces and Python workflows for practical tasks in content production, e-commerce and community management. I focus on connecting frontend and backend, making workflow states traceable and testing failure cases. I use AI agents while taking responsibility for requirements and acceptance testing. Four years in sales taught me to understand customer needs through direct conversation.</w:t>
       </w:r>
     </w:p>
     <w:p>
@@ -32,36 +61,26 @@
         <w:pStyle w:val="BodyText"/>
       </w:pPr>
       <w:r>
-        <w:t xml:space="preserve">Email: jason@roschmann-digital.de | Phone: +49 155 612 953 91</w:t>
-      </w:r>
-      <w:r>
-        <w:br/>
-      </w:r>
-      <w:r>
-        <w:t xml:space="preserve">LinkedIn: linkedin.com/in/jason-roschmann-1091512b2 | GitHub: github.com/JasonRoschmann | Web CV: jasonroschmann.github.io/cv</w:t>
-      </w:r>
-      <w:r>
-        <w:br/>
-      </w:r>
-      <w:r>
-        <w:t xml:space="preserve">Location: Hamburg, Germany | Looking for: Hamburg or remote; relocation to Zurich possible for the right role | Start date by arrangement</w:t>
-      </w:r>
-    </w:p>
-    <w:p>
-      <w:pPr>
-        <w:pStyle w:val="BodyText"/>
-      </w:pPr>
-      <w:r>
-        <w:t xml:space="preserve">Core stack: Python, FastAPI, TypeScript, React/Next.js, PostgreSQL, Docker</w:t>
-      </w:r>
-    </w:p>
-    <w:bookmarkStart w:id="9" w:name="profile"/>
+        <w:t xml:space="preserve">Key figures: 50 of my pull requests merged (Flowki Studio, team project) · 21 → 0 failing tests, two root causes fixed (hermes-studio) · about 66 Discord members, FlowKI Club (as of 29 Sep 2026) · 4 years of B2B sales with daily customer contact (2019–2023)</w:t>
+      </w:r>
+    </w:p>
+    <w:bookmarkEnd w:id="9"/>
+    <w:bookmarkStart w:id="15" w:name="projects"/>
     <w:p>
       <w:pPr>
         <w:pStyle w:val="Heading2"/>
       </w:pPr>
       <w:r>
-        <w:t xml:space="preserve">Profile</w:t>
+        <w:t xml:space="preserve">Projects</w:t>
+      </w:r>
+    </w:p>
+    <w:bookmarkStart w:id="10" w:name="X473bfa07b9a1c2ba63cbeaad9fc1fdc9fb098d3"/>
+    <w:p>
+      <w:pPr>
+        <w:pStyle w:val="Heading3"/>
+      </w:pPr>
+      <w:r>
+        <w:t xml:space="preserve">Flowki Studio — internal social media studio, team project (Aug 2026 – present)</w:t>
       </w:r>
     </w:p>
     <w:p>
@@ -69,26 +88,97 @@
         <w:pStyle w:val="FirstParagraph"/>
       </w:pPr>
       <w:r>
-        <w:t xml:space="preserve">I build AI automations and web applications with Python and TypeScript, on my own and in a team. My experience includes API integration, background jobs and targeted tests against duplicate actions and data loss. I use AI agents for implementation; I define the requirements for my contributions and verify that they are met. I am looking for a junior role in AI automation or backend/full-stack development.</w:t>
-      </w:r>
-    </w:p>
-    <w:bookmarkEnd w:id="9"/>
-    <w:bookmarkStart w:id="13" w:name="projects"/>
-    <w:p>
-      <w:pPr>
-        <w:pStyle w:val="Heading2"/>
-      </w:pPr>
-      <w:r>
-        <w:t xml:space="preserve">Projects</w:t>
-      </w:r>
-    </w:p>
-    <w:bookmarkStart w:id="10" w:name="X067eb8d797dea5bdb3147e7b041acb514304d0a"/>
+        <w:t xml:space="preserve">Purpose: Internal social media studio for topic research, AI-assisted content production, editorial review and handover to platforms; my contribution in the team: product interfaces, workflow integration, clip processing and publishing.</w:t>
+      </w:r>
+    </w:p>
+    <w:p>
+      <w:pPr>
+        <w:pStyle w:val="Compact"/>
+        <w:numPr>
+          <w:ilvl w:val="0"/>
+          <w:numId w:val="1001"/>
+        </w:numPr>
+      </w:pPr>
+      <w:r>
+        <w:t xml:space="preserve">Product interface: Further developed the production, approval and publishing views – made processing states, phase durations and required user actions visible.</w:t>
+      </w:r>
+    </w:p>
+    <w:p>
+      <w:pPr>
+        <w:pStyle w:val="Compact"/>
+        <w:numPr>
+          <w:ilvl w:val="0"/>
+          <w:numId w:val="1001"/>
+        </w:numPr>
+      </w:pPr>
+      <w:r>
+        <w:t xml:space="preserve">Editorial collaboration: Connected rejection reasons across the interface, API client and approval log – returns for revision now carry a traceable reason.</w:t>
+      </w:r>
+    </w:p>
+    <w:p>
+      <w:pPr>
+        <w:pStyle w:val="Compact"/>
+        <w:numPr>
+          <w:ilvl w:val="0"/>
+          <w:numId w:val="1001"/>
+        </w:numPr>
+      </w:pPr>
+      <w:r>
+        <w:t xml:space="preserve">Error handling: Separated successful production or licensing from subsequent status and assignment errors – removed misleading error messages and incentives for repeated, cost-incurring calls.</w:t>
+      </w:r>
+    </w:p>
+    <w:p>
+      <w:pPr>
+        <w:pStyle w:val="Compact"/>
+        <w:numPr>
+          <w:ilvl w:val="0"/>
+          <w:numId w:val="1001"/>
+        </w:numPr>
+      </w:pPr>
+      <w:r>
+        <w:t xml:space="preserve">Video processing: Implemented speaker-focused reframing, alternative edits and reproducible re-rendering after corrections – long videos become editable vertical clips.</w:t>
+      </w:r>
+    </w:p>
+    <w:p>
+      <w:pPr>
+        <w:pStyle w:val="Compact"/>
+        <w:numPr>
+          <w:ilvl w:val="0"/>
+          <w:numId w:val="1001"/>
+        </w:numPr>
+      </w:pPr>
+      <w:r>
+        <w:t xml:space="preserve">Publishing: Integrated the TikTok draft path with its own status and user notice – uploaded drafts are clearly distinguished from published posts.</w:t>
+      </w:r>
+    </w:p>
+    <w:p>
+      <w:pPr>
+        <w:pStyle w:val="Compact"/>
+        <w:numPr>
+          <w:ilvl w:val="0"/>
+          <w:numId w:val="1001"/>
+        </w:numPr>
+      </w:pPr>
+      <w:r>
+        <w:t xml:space="preserve">Quality assurance: Reproduced failure cases first and validated fixes with targeted tests.</w:t>
+      </w:r>
+    </w:p>
+    <w:p>
+      <w:pPr>
+        <w:pStyle w:val="FirstParagraph"/>
+      </w:pPr>
+      <w:r>
+        <w:t xml:space="preserve">Tools: Python, FastAPI, Celery, SQLAlchemy/Alembic, PostgreSQL, Redis, Next.js, TypeScript</w:t>
+      </w:r>
+    </w:p>
+    <w:bookmarkEnd w:id="10"/>
+    <w:bookmarkStart w:id="11" w:name="X587fe435084c54bbfaa57afd28932d2f680f277"/>
     <w:p>
       <w:pPr>
         <w:pStyle w:val="Heading3"/>
       </w:pPr>
       <w:r>
-        <w:t xml:space="preserve">Flowki Studio — Clip Studio (team project, Aug–Sep 2026)</w:t>
+        <w:t xml:space="preserve">FlowKI Club — Co-founder, website, Discord bot, newsletter (Apr 2026 – present)</w:t>
       </w:r>
     </w:p>
     <w:p>
@@ -96,123 +186,167 @@
         <w:pStyle w:val="FirstParagraph"/>
       </w:pPr>
       <w:r>
-        <w:t xml:space="preserve">Purpose: internal social media studio with trends, platform playbooks and an AI content pipeline. The clip studio turns long videos into shorts — my focus. 64 pull requests in Flowki Studio, 50 of them merged.</w:t>
-      </w:r>
-    </w:p>
-    <w:p>
-      <w:pPr>
-        <w:pStyle w:val="Compact"/>
-        <w:numPr>
-          <w:ilvl w:val="0"/>
-          <w:numId w:val="1001"/>
-        </w:numPr>
-      </w:pPr>
-      <w:r>
-        <w:t xml:space="preserve">Speaker reframe: face position measured at several points in time instead of once, smoothed into piecewise-constant 9:16 keyframes — the crop follows the person speaking.</w:t>
-      </w:r>
-    </w:p>
-    <w:p>
-      <w:pPr>
-        <w:pStyle w:val="Compact"/>
-        <w:numPr>
-          <w:ilvl w:val="0"/>
-          <w:numId w:val="1001"/>
-        </w:numPr>
-      </w:pPr>
-      <w:r>
-        <w:t xml:space="preserve">Deterministic re-render after corrections: append-only plan versions, every plan change invalidates a previously granted approval; rendering runs asynchronously on Celery, without model costs.</w:t>
-      </w:r>
-    </w:p>
-    <w:p>
-      <w:pPr>
-        <w:pStyle w:val="Compact"/>
-        <w:numPr>
-          <w:ilvl w:val="0"/>
-          <w:numId w:val="1001"/>
-        </w:numPr>
-      </w:pPr>
-      <w:r>
-        <w:t xml:space="preserve">Up to three cut variants per clip, at most one per target account (database constraint); publishing rights re-checked immediately before sending.</w:t>
-      </w:r>
-    </w:p>
-    <w:p>
-      <w:pPr>
-        <w:pStyle w:val="Compact"/>
-        <w:numPr>
-          <w:ilvl w:val="0"/>
-          <w:numId w:val="1001"/>
-        </w:numPr>
-      </w:pPr>
-      <w:r>
-        <w:t xml:space="preserve">Stack: Python, FastAPI, Celery, SQLAlchemy/Alembic, PostgreSQL, Redis, MinIO, Next.js</w:t>
-      </w:r>
-    </w:p>
-    <w:bookmarkEnd w:id="10"/>
-    <w:bookmarkStart w:id="11" w:name="X82fe21a987500f78d71071531b7058557d5227c"/>
+        <w:t xml:space="preserve">Purpose: German-speaking AI community – about 66 members (Discord, as of 29 Sep 2026) – with articles, online calls and joint project work; I combine community work with technical product development.</w:t>
+      </w:r>
+    </w:p>
+    <w:p>
+      <w:pPr>
+        <w:pStyle w:val="Compact"/>
+        <w:numPr>
+          <w:ilvl w:val="0"/>
+          <w:numId w:val="1002"/>
+        </w:numPr>
+      </w:pPr>
+      <w:r>
+        <w:t xml:space="preserve">Community tools: Extended the Discord bot with /ask and self-service topic roles; updated discord.js and test tooling.</w:t>
+      </w:r>
+    </w:p>
+    <w:p>
+      <w:pPr>
+        <w:pStyle w:val="Compact"/>
+        <w:numPr>
+          <w:ilvl w:val="0"/>
+          <w:numId w:val="1002"/>
+        </w:numPr>
+      </w:pPr>
+      <w:r>
+        <w:t xml:space="preserve">AI answer quality: Connected article content as the knowledge base of the FAQ bot and added a relevance check – tested how the bot handles irrelevant matches.</w:t>
+      </w:r>
+    </w:p>
+    <w:p>
+      <w:pPr>
+        <w:pStyle w:val="Compact"/>
+        <w:numPr>
+          <w:ilvl w:val="0"/>
+          <w:numId w:val="1002"/>
+        </w:numPr>
+      </w:pPr>
+      <w:r>
+        <w:t xml:space="preserve">Website &amp; newsletter: Newsletter with double opt-in and referral links, Plausible events for sign-ups and clicks on Discord invite links; author, FAQ and HowTo markup in the article output.</w:t>
+      </w:r>
+    </w:p>
+    <w:p>
+      <w:pPr>
+        <w:pStyle w:val="Compact"/>
+        <w:numPr>
+          <w:ilvl w:val="0"/>
+          <w:numId w:val="1002"/>
+        </w:numPr>
+      </w:pPr>
+      <w:r>
+        <w:t xml:space="preserve">Community: Helped new members get started, organised and moderated online calls, supported members with their projects.</w:t>
+      </w:r>
+    </w:p>
+    <w:p>
+      <w:pPr>
+        <w:pStyle w:val="FirstParagraph"/>
+      </w:pPr>
+      <w:r>
+        <w:t xml:space="preserve">Tools: TypeScript, discord.js, Claude API, PostgreSQL, Vitest, Next.js</w:t>
+      </w:r>
+    </w:p>
+    <w:bookmarkEnd w:id="11"/>
+    <w:bookmarkStart w:id="12" w:name="X5d0b748d8ad8485479916fda699d40d3bbd88e5"/>
     <w:p>
       <w:pPr>
         <w:pStyle w:val="Heading3"/>
       </w:pPr>
       <w:r>
-        <w:t xml:space="preserve">Debugging case study — hermes-studio (contribution to a third-party project, Sep 2026)</w:t>
-      </w:r>
-    </w:p>
-    <w:p>
-      <w:pPr>
-        <w:pStyle w:val="Compact"/>
-        <w:numPr>
-          <w:ilvl w:val="0"/>
-          <w:numId w:val="1002"/>
-        </w:numPr>
-      </w:pPr>
-      <w:r>
-        <w:t xml:space="preserve">Cause: 21 failing tests, two root causes — 20× an SQLite handle that was never closed and blocks cleanup on Windows; 1× an outdated test against a security rule.</w:t>
-      </w:r>
-    </w:p>
-    <w:p>
-      <w:pPr>
-        <w:pStyle w:val="Compact"/>
-        <w:numPr>
-          <w:ilvl w:val="0"/>
-          <w:numId w:val="1002"/>
-        </w:numPr>
-      </w:pPr>
-      <w:r>
-        <w:t xml:space="preserve">Fix: handle closed, security rule kept, test corrected. In a separate contribution, I fixed silent data loss in the task store and added five tests.</w:t>
-      </w:r>
-    </w:p>
-    <w:p>
-      <w:pPr>
-        <w:pStyle w:val="Compact"/>
-        <w:numPr>
-          <w:ilvl w:val="0"/>
-          <w:numId w:val="1002"/>
-        </w:numPr>
-      </w:pPr>
-      <w:r>
-        <w:t xml:space="preserve">Evidence: mutation test — deliberately weakening the security rule made the corrected test fail. Test suite from 177 to 199 passing tests.</w:t>
-      </w:r>
-    </w:p>
-    <w:p>
-      <w:pPr>
-        <w:pStyle w:val="Compact"/>
-        <w:numPr>
-          <w:ilvl w:val="0"/>
-          <w:numId w:val="1002"/>
-        </w:numPr>
-      </w:pPr>
-      <w:r>
-        <w:t xml:space="preserve">How I work with AI agents: every bug first as a failing test, the agent implements, a second model provides an additional review, rollout with checksums and automatic rollback.</w:t>
-      </w:r>
-    </w:p>
-    <w:bookmarkEnd w:id="11"/>
-    <w:bookmarkStart w:id="12" w:name="Xa24f75b7c41d1b721c4b7f3e671010301f5c2d3"/>
+        <w:t xml:space="preserve">hermes-studio — contribution to a third-party project, debugging (Sep 2026)</w:t>
+      </w:r>
+    </w:p>
+    <w:p>
+      <w:pPr>
+        <w:pStyle w:val="Compact"/>
+        <w:numPr>
+          <w:ilvl w:val="0"/>
+          <w:numId w:val="1003"/>
+        </w:numPr>
+      </w:pPr>
+      <w:r>
+        <w:t xml:space="preserve">Cause: 21 failing tests with two root causes – 20× an SQLite handle that was never closed and blocks cleanup on Windows, 1× an outdated test against a security rule; handle closed, rule kept, test corrected.</w:t>
+      </w:r>
+    </w:p>
+    <w:p>
+      <w:pPr>
+        <w:pStyle w:val="Compact"/>
+        <w:numPr>
+          <w:ilvl w:val="0"/>
+          <w:numId w:val="1003"/>
+        </w:numPr>
+      </w:pPr>
+      <w:r>
+        <w:t xml:space="preserve">Evidence: Mutation test – with the security rule weakened, the corrected test fails; passing tests: 177/198 → 199/199.</w:t>
+      </w:r>
+    </w:p>
+    <w:p>
+      <w:pPr>
+        <w:pStyle w:val="Compact"/>
+        <w:numPr>
+          <w:ilvl w:val="0"/>
+          <w:numId w:val="1003"/>
+        </w:numPr>
+      </w:pPr>
+      <w:r>
+        <w:t xml:space="preserve">Own contribution: Fixed silent data loss in the task store, with five new tests.</w:t>
+      </w:r>
+    </w:p>
+    <w:bookmarkEnd w:id="12"/>
+    <w:bookmarkStart w:id="13" w:name="X4aa24a74fffee8cce9a962c7eb549ced142aaf3"/>
     <w:p>
       <w:pPr>
         <w:pStyle w:val="Heading3"/>
       </w:pPr>
       <w:r>
-        <w:t xml:space="preserve">AI-assisted job application management (personal project, since July 2026)</w:t>
+        <w:t xml:space="preserve">duftkumpels.shop — client project, Shopify, API &amp; translation automation (Jun 2026 – present)</w:t>
+      </w:r>
+    </w:p>
+    <w:p>
+      <w:pPr>
+        <w:pStyle w:val="Compact"/>
+        <w:numPr>
+          <w:ilvl w:val="0"/>
+          <w:numId w:val="1004"/>
+        </w:numPr>
+      </w:pPr>
+      <w:r>
+        <w:t xml:space="preserve">Automation: DE/EN/FR translation pipeline with HTML extraction, structure checks and import via CSV or GraphQL; availability checks via the Admin GraphQL API, with backups and read-back verification.</w:t>
+      </w:r>
+    </w:p>
+    <w:p>
+      <w:pPr>
+        <w:pStyle w:val="Compact"/>
+        <w:numPr>
+          <w:ilvl w:val="0"/>
+          <w:numId w:val="1004"/>
+        </w:numPr>
+      </w:pPr>
+      <w:r>
+        <w:t xml:space="preserve">SEO engineering: Automated a Search Console analysis, checked 700 URLs for indexing; added JSON-LD and checked it automatically.</w:t>
+      </w:r>
+    </w:p>
+    <w:p>
+      <w:pPr>
+        <w:pStyle w:val="Compact"/>
+        <w:numPr>
+          <w:ilvl w:val="0"/>
+          <w:numId w:val="1004"/>
+        </w:numPr>
+      </w:pPr>
+      <w:r>
+        <w:t xml:space="preserve">Theme &amp; quality: Reworked a purchased theme in Liquid, CSS and JavaScript; weekly Lighthouse checks against the live shop via GitHub Actions.</w:t>
+      </w:r>
+    </w:p>
+    <w:p>
+      <w:pPr>
+        <w:pStyle w:val="Compact"/>
+        <w:numPr>
+          <w:ilvl w:val="0"/>
+          <w:numId w:val="1004"/>
+        </w:numPr>
+      </w:pPr>
+      <w:r>
+        <w:t xml:space="preserve">Email: Fixed a Klaviyo abandonment email to link to a recoverable checkout.</w:t>
       </w:r>
     </w:p>
     <w:p>
@@ -220,66 +354,17 @@
         <w:pStyle w:val="FirstParagraph"/>
       </w:pPr>
       <w:r>
-        <w:t xml:space="preserve">Purpose: Python pipeline for job search via job board APIs (including the German Federal Employment Agency, Greenhouse, Lever), cover letters, checks, sending and reply matching. Focus: traceable actions. 94 Python files, 56 of them test files.</w:t>
-      </w:r>
-    </w:p>
-    <w:p>
-      <w:pPr>
-        <w:pStyle w:val="Compact"/>
-        <w:numPr>
-          <w:ilvl w:val="0"/>
-          <w:numId w:val="1003"/>
-        </w:numPr>
-      </w:pPr>
-      <w:r>
-        <w:t xml:space="preserve">Cross-channel ledger for first applications with reservations: no duplicate application across email and portal, at most one application per company within 14 days.</w:t>
-      </w:r>
-    </w:p>
-    <w:p>
-      <w:pPr>
-        <w:pStyle w:val="Compact"/>
-        <w:numPr>
-          <w:ilvl w:val="0"/>
-          <w:numId w:val="1003"/>
-        </w:numPr>
-      </w:pPr>
-      <w:r>
-        <w:t xml:space="preserve">Blocking checks before sending: unusable model output stops the run; model cascade (Claude, Gemini, Groq) with cool-down periods.</w:t>
-      </w:r>
-    </w:p>
-    <w:p>
-      <w:pPr>
-        <w:pStyle w:val="Compact"/>
-        <w:numPr>
-          <w:ilvl w:val="0"/>
-          <w:numId w:val="1003"/>
-        </w:numPr>
-      </w:pPr>
-      <w:r>
-        <w:t xml:space="preserve">Checked LLM ratings against blind reference judgements; did not roll out a revised analysis after an incomplete measurement showed no proven improvement.</w:t>
-      </w:r>
-    </w:p>
-    <w:p>
-      <w:pPr>
-        <w:pStyle w:val="Compact"/>
-        <w:numPr>
-          <w:ilvl w:val="0"/>
-          <w:numId w:val="1003"/>
-        </w:numPr>
-      </w:pPr>
-      <w:r>
-        <w:t xml:space="preserve">Rollouts with checksums, tests before and after the swap, and automatic rollback.</w:t>
-      </w:r>
-    </w:p>
-    <w:bookmarkEnd w:id="12"/>
+        <w:t xml:space="preserve">Tools: Shopify Liquid, Admin GraphQL API, Python, GitHub Actions, Klaviyo</w:t>
+      </w:r>
+    </w:p>
     <w:bookmarkEnd w:id="13"/>
-    <w:bookmarkStart w:id="14" w:name="web-shop-development-for-clients"/>
-    <w:p>
-      <w:pPr>
-        <w:pStyle w:val="Heading2"/>
-      </w:pPr>
-      <w:r>
-        <w:t xml:space="preserve">Web &amp; shop development for clients</w:t>
+    <w:bookmarkStart w:id="14" w:name="Xd8b9fd33b2b2cd85458e246aba39de1f8a0c7dc"/>
+    <w:p>
+      <w:pPr>
+        <w:pStyle w:val="Heading3"/>
+      </w:pPr>
+      <w:r>
+        <w:t xml:space="preserve">AI-assisted job application management — personal project, Python (Jul 2026 – present)</w:t>
       </w:r>
     </w:p>
     <w:p>
@@ -287,151 +372,58 @@
         <w:pStyle w:val="FirstParagraph"/>
       </w:pPr>
       <w:r>
-        <w:t xml:space="preserve">Websites and shops for clients — design, multilingual content, legal requirements, CI and delivery.</w:t>
-      </w:r>
-    </w:p>
-    <w:p>
-      <w:pPr>
-        <w:pStyle w:val="Compact"/>
-        <w:numPr>
-          <w:ilvl w:val="0"/>
-          <w:numId w:val="1004"/>
-        </w:numPr>
-      </w:pPr>
-      <w:r>
-        <w:t xml:space="preserve">Frontend &amp; interaction: Next.js, React, TypeScript, GSAP — hero as a frame sequence that turns with the mouse pointer (on phones via device tilt); full-screen chapters with dedicated mobile controls (nk247store.de).</w:t>
-      </w:r>
-    </w:p>
-    <w:p>
-      <w:pPr>
-        <w:pStyle w:val="Compact"/>
-        <w:numPr>
-          <w:ilvl w:val="0"/>
-          <w:numId w:val="1004"/>
-        </w:numPr>
-      </w:pPr>
-      <w:r>
-        <w:t xml:space="preserve">Shop &amp; content: reworked a purchased Shopify theme in Liquid, CSS and JavaScript; own design layer in the live theme, product data via metafields (duftkumpels.shop).</w:t>
-      </w:r>
-    </w:p>
-    <w:p>
-      <w:pPr>
-        <w:pStyle w:val="Compact"/>
-        <w:numPr>
-          <w:ilvl w:val="0"/>
-          <w:numId w:val="1004"/>
-        </w:numPr>
-      </w:pPr>
-      <w:r>
-        <w:t xml:space="preserve">SEO &amp; email: Automated a Search Console analysis of search queries and adjusted titles and metadata accordingly; checked the indexing status of 700 URLs; fixed a Klaviyo abandonment email to link to a recoverable checkout (duftkumpels.shop).</w:t>
-      </w:r>
-    </w:p>
-    <w:p>
-      <w:pPr>
-        <w:pStyle w:val="Compact"/>
-        <w:numPr>
-          <w:ilvl w:val="0"/>
-          <w:numId w:val="1004"/>
-        </w:numPr>
-      </w:pPr>
-      <w:r>
-        <w:t xml:space="preserve">Quality &amp; delivery: CI with TypeScript check, ESLint, Vitest, build and Playwright (nk247store.de); weekly Lighthouse checks against the live shop via GitHub Actions (duftkumpels.shop).</w:t>
-      </w:r>
-    </w:p>
-    <w:p>
-      <w:pPr>
-        <w:pStyle w:val="Compact"/>
-        <w:numPr>
-          <w:ilvl w:val="0"/>
-          <w:numId w:val="1004"/>
-        </w:numPr>
-      </w:pPr>
-      <w:r>
-        <w:t xml:space="preserve">Multilingual: built a DE/EN/FR translation pipeline with HTML extraction, structure checks and import via CSV or GraphQL; localised product names and collection copy (duftkumpels.shop).</w:t>
-      </w:r>
-    </w:p>
-    <w:p>
-      <w:pPr>
-        <w:pStyle w:val="Compact"/>
-        <w:numPr>
-          <w:ilvl w:val="0"/>
-          <w:numId w:val="1004"/>
-        </w:numPr>
-      </w:pPr>
-      <w:r>
-        <w:t xml:space="preserve">Legal &amp; content: tobacco advertising removed from all visuals per German law, § 19 TabakerzG (nk247store.de).</w:t>
-      </w:r>
-    </w:p>
-    <w:p>
-      <w:pPr>
-        <w:pStyle w:val="Compact"/>
-        <w:numPr>
-          <w:ilvl w:val="0"/>
-          <w:numId w:val="1004"/>
-        </w:numPr>
-      </w:pPr>
-      <w:r>
-        <w:t xml:space="preserve">AI tools: wrote the design brief, steered an AI website builder and refined the result myself — camera moves from real photos, colour grading, transitions (redesign draft for a Hamburg izakaya).</w:t>
-      </w:r>
-    </w:p>
-    <w:p>
-      <w:pPr>
-        <w:pStyle w:val="Compact"/>
-        <w:numPr>
-          <w:ilvl w:val="0"/>
-          <w:numId w:val="1004"/>
-        </w:numPr>
-      </w:pPr>
-      <w:r>
-        <w:t xml:space="preserve">References: duftkumpels.shop — project work since June 2026, changes in the live theme; nk247store.de — client project in a team, my redesign not yet published.</w:t>
+        <w:t xml:space="preserve">Purpose: Python pipeline for job search via job board APIs (including the German Federal Employment Agency, Greenhouse, Lever), cover letters, checks, sending and reply matching.</w:t>
+      </w:r>
+    </w:p>
+    <w:p>
+      <w:pPr>
+        <w:pStyle w:val="Compact"/>
+        <w:numPr>
+          <w:ilvl w:val="0"/>
+          <w:numId w:val="1005"/>
+        </w:numPr>
+      </w:pPr>
+      <w:r>
+        <w:t xml:space="preserve">Traceability: Cross-channel ledger for first applications with reservations – no duplicate application across email and portal, at most one application per company within 14 days.</w:t>
+      </w:r>
+    </w:p>
+    <w:p>
+      <w:pPr>
+        <w:pStyle w:val="Compact"/>
+        <w:numPr>
+          <w:ilvl w:val="0"/>
+          <w:numId w:val="1005"/>
+        </w:numPr>
+      </w:pPr>
+      <w:r>
+        <w:t xml:space="preserve">Checks before sending: Unusable model output stops the run; model cascade (Claude, Gemini, Groq) with cool-down periods.</w:t>
+      </w:r>
+    </w:p>
+    <w:p>
+      <w:pPr>
+        <w:pStyle w:val="Compact"/>
+        <w:numPr>
+          <w:ilvl w:val="0"/>
+          <w:numId w:val="1005"/>
+        </w:numPr>
+      </w:pPr>
+      <w:r>
+        <w:t xml:space="preserve">Rating quality: Checked LLM ratings against blind reference judgements; did not roll out a revised analysis after an incomplete measurement showed no proven improvement.</w:t>
+      </w:r>
+    </w:p>
+    <w:p>
+      <w:pPr>
+        <w:pStyle w:val="Compact"/>
+        <w:numPr>
+          <w:ilvl w:val="0"/>
+          <w:numId w:val="1005"/>
+        </w:numPr>
+      </w:pPr>
+      <w:r>
+        <w:t xml:space="preserve">Operations: Rollouts with checksums, tests before and after the swap and automatic rollback on caught errors.</w:t>
       </w:r>
     </w:p>
     <w:bookmarkEnd w:id="14"/>
-    <w:bookmarkStart w:id="15" w:name="further-projects"/>
-    <w:p>
-      <w:pPr>
-        <w:pStyle w:val="Heading2"/>
-      </w:pPr>
-      <w:r>
-        <w:t xml:space="preserve">Further projects</w:t>
-      </w:r>
-    </w:p>
-    <w:p>
-      <w:pPr>
-        <w:pStyle w:val="Compact"/>
-        <w:numPr>
-          <w:ilvl w:val="0"/>
-          <w:numId w:val="1005"/>
-        </w:numPr>
-      </w:pPr>
-      <w:r>
-        <w:t xml:space="preserve">hermes-brett: task board plugin for Hermes Agent without a build step; a cost gate prevents the board from accidentally starting a paid agent run; deploy with rollback; self-test using only node:assert.</w:t>
-      </w:r>
-    </w:p>
-    <w:p>
-      <w:pPr>
-        <w:pStyle w:val="Compact"/>
-        <w:numPr>
-          <w:ilvl w:val="0"/>
-          <w:numId w:val="1005"/>
-        </w:numPr>
-      </w:pPr>
-      <w:r>
-        <w:t xml:space="preserve">Shinobi: Ember Accord — mobile idle RPG (React Native, Skia, Supabase, pgTAP). Agent-orchestrated: an AI agent works through 50 roles in lead mode; I make the product decisions.</w:t>
-      </w:r>
-    </w:p>
-    <w:p>
-      <w:pPr>
-        <w:pStyle w:val="Compact"/>
-        <w:numPr>
-          <w:ilvl w:val="0"/>
-          <w:numId w:val="1005"/>
-        </w:numPr>
-      </w:pPr>
-      <w:r>
-        <w:t xml:space="preserve">Interactive web CV — installable PWA without a framework: SVG displacement, canvas graph, WebGL fluid simulation (adapted from PavelDoGreat, MIT).</w:t>
-      </w:r>
-    </w:p>
     <w:bookmarkEnd w:id="15"/>
     <w:bookmarkStart w:id="18" w:name="experience"/>
     <w:p>
@@ -442,25 +434,13 @@
         <w:t xml:space="preserve">Experience</w:t>
       </w:r>
     </w:p>
-    <w:bookmarkStart w:id="16" w:name="ai-automation-web-development"/>
+    <w:bookmarkStart w:id="16" w:name="Xe9df34ccdc54d9ff237663bc67bcda9f1e87765"/>
     <w:p>
       <w:pPr>
         <w:pStyle w:val="Heading3"/>
       </w:pPr>
       <w:r>
-        <w:t xml:space="preserve">AI Automation &amp; Web Development</w:t>
-      </w:r>
-    </w:p>
-    <w:p>
-      <w:pPr>
-        <w:pStyle w:val="FirstParagraph"/>
-      </w:pPr>
-      <w:r>
-        <w:rPr>
-          <w:b/>
-          <w:bCs/>
-        </w:rPr>
-        <w:t xml:space="preserve">2024 – present | Own projects, team and client projects | Hamburg / remote</w:t>
+        <w:t xml:space="preserve">AI Automation &amp; Web Development — own projects, team and client projects (2024 – present)</w:t>
       </w:r>
     </w:p>
     <w:p>
@@ -475,26 +455,26 @@
         <w:t xml:space="preserve">Developed and tested Python backends and Next.js frontends and ran them on Linux servers (Docker Compose, cron, deployment with rollback); customised Shopify themes; teamwork via branches, pull requests and shared test suites.</w:t>
       </w:r>
     </w:p>
+    <w:p>
+      <w:pPr>
+        <w:pStyle w:val="Compact"/>
+        <w:numPr>
+          <w:ilvl w:val="0"/>
+          <w:numId w:val="1006"/>
+        </w:numPr>
+      </w:pPr>
+      <w:r>
+        <w:t xml:space="preserve">nk247store.de (client project in a team): interactive redesign with Next.js and GSAP; CI with TypeScript check, ESLint, Vitest, build and Playwright. My redesign is not yet published.</w:t>
+      </w:r>
+    </w:p>
     <w:bookmarkEnd w:id="16"/>
-    <w:bookmarkStart w:id="17" w:name="b2b-direct-sales-door-to-door"/>
+    <w:bookmarkStart w:id="17" w:name="X76f8e4e26449ffe30aec7748ad9ee2668240c95"/>
     <w:p>
       <w:pPr>
         <w:pStyle w:val="Heading3"/>
       </w:pPr>
       <w:r>
-        <w:t xml:space="preserve">B2B Direct Sales (door-to-door)</w:t>
-      </w:r>
-    </w:p>
-    <w:p>
-      <w:pPr>
-        <w:pStyle w:val="FirstParagraph"/>
-      </w:pPr>
-      <w:r>
-        <w:rPr>
-          <w:b/>
-          <w:bCs/>
-        </w:rPr>
-        <w:t xml:space="preserve">2019 – 2023 | EWE TEL, Ranger Marketing | Field sales across Germany</w:t>
+        <w:t xml:space="preserve">B2B Direct Sales — Field sales (door-to-door) across Germany, EWE TEL and Ranger Marketing (2019 – 2023)</w:t>
       </w:r>
     </w:p>
     <w:p>
@@ -506,7 +486,7 @@
         </w:numPr>
       </w:pPr>
       <w:r>
-        <w:t xml:space="preserve">Cold outreach and needs assessment directly with owners and managing directors, negotiation and closing on site.</w:t>
+        <w:t xml:space="preserve">Cold outreach and needs assessment with owners and managing directors, negotiation and closing on site.</w:t>
       </w:r>
     </w:p>
     <w:p>
@@ -518,18 +498,18 @@
         </w:numPr>
       </w:pPr>
       <w:r>
-        <w:t xml:space="preserve">Handling rejection every day — and an eye for the problems a business really has.</w:t>
+        <w:t xml:space="preserve">Handling rejection every day – and an eye for the problems a business really has.</w:t>
       </w:r>
     </w:p>
     <w:bookmarkEnd w:id="17"/>
     <w:bookmarkEnd w:id="18"/>
-    <w:bookmarkStart w:id="20" w:name="training-and-project-practice"/>
+    <w:bookmarkStart w:id="19" w:name="skills-way-of-working"/>
     <w:p>
       <w:pPr>
         <w:pStyle w:val="Heading2"/>
       </w:pPr>
       <w:r>
-        <w:t xml:space="preserve">Training and project practice</w:t>
+        <w:t xml:space="preserve">Skills &amp; way of working</w:t>
       </w:r>
     </w:p>
     <w:p>
@@ -541,7 +521,7 @@
         </w:numPr>
       </w:pPr>
       <w:r>
-        <w:t xml:space="preserve">Web development course, 2024 (6 months): HTML, CSS, JavaScript, web architecture</w:t>
+        <w:t xml:space="preserve">Development: Python, FastAPI · TypeScript, React, Next.js, discord.js · React Native (project experience: Shinobi)</w:t>
       </w:r>
     </w:p>
     <w:p>
@@ -553,12 +533,106 @@
         </w:numPr>
       </w:pPr>
       <w:r>
-        <w:t xml:space="preserve">Google Ads Search Certification (Skillshop), December 2025, valid until 3 December 2026 – verifiable:</w:t>
+        <w:t xml:space="preserve">AI &amp; agents: Claude Code, LLM APIs (Claude, Gemini, Groq), MCP, agent orchestration, n8n</w:t>
+      </w:r>
+    </w:p>
+    <w:p>
+      <w:pPr>
+        <w:pStyle w:val="Compact"/>
+        <w:numPr>
+          <w:ilvl w:val="0"/>
+          <w:numId w:val="1008"/>
+        </w:numPr>
+      </w:pPr>
+      <w:r>
+        <w:t xml:space="preserve">Data &amp; jobs: PostgreSQL, SQLAlchemy/Alembic, Celery, Redis, Supabase</w:t>
+      </w:r>
+    </w:p>
+    <w:p>
+      <w:pPr>
+        <w:pStyle w:val="Compact"/>
+        <w:numPr>
+          <w:ilvl w:val="0"/>
+          <w:numId w:val="1008"/>
+        </w:numPr>
+      </w:pPr>
+      <w:r>
+        <w:t xml:space="preserve">Quality: pytest, Vitest, Playwright, GitHub Actions, Lighthouse CI</w:t>
+      </w:r>
+    </w:p>
+    <w:p>
+      <w:pPr>
+        <w:pStyle w:val="Compact"/>
+        <w:numPr>
+          <w:ilvl w:val="0"/>
+          <w:numId w:val="1008"/>
+        </w:numPr>
+      </w:pPr>
+      <w:r>
+        <w:t xml:space="preserve">Operations: Linux servers, Docker Compose, cron, flock, SMTP/IMAP, SPF/DKIM</w:t>
+      </w:r>
+    </w:p>
+    <w:p>
+      <w:pPr>
+        <w:pStyle w:val="Compact"/>
+        <w:numPr>
+          <w:ilvl w:val="0"/>
+          <w:numId w:val="1008"/>
+        </w:numPr>
+      </w:pPr>
+      <w:r>
+        <w:t xml:space="preserve">Web &amp; commerce: Shopify Liquid, Tailwind, GSAP, PWA, Canvas/WebGL</w:t>
+      </w:r>
+    </w:p>
+    <w:p>
+      <w:pPr>
+        <w:pStyle w:val="Compact"/>
+        <w:numPr>
+          <w:ilvl w:val="0"/>
+          <w:numId w:val="1008"/>
+        </w:numPr>
+      </w:pPr>
+      <w:r>
+        <w:t xml:space="preserve">With AI agents: Reproduce bugs with failing tests · an agent implements the fix · a second model provides an additional review · rollout with checksums and automatic rollback on caught errors</w:t>
+      </w:r>
+    </w:p>
+    <w:bookmarkEnd w:id="19"/>
+    <w:bookmarkStart w:id="21" w:name="training-certificate-languages"/>
+    <w:p>
+      <w:pPr>
+        <w:pStyle w:val="Heading2"/>
+      </w:pPr>
+      <w:r>
+        <w:t xml:space="preserve">Training, certificate &amp; languages</w:t>
+      </w:r>
+    </w:p>
+    <w:p>
+      <w:pPr>
+        <w:pStyle w:val="Compact"/>
+        <w:numPr>
+          <w:ilvl w:val="0"/>
+          <w:numId w:val="1009"/>
+        </w:numPr>
+      </w:pPr>
+      <w:r>
+        <w:t xml:space="preserve">Training: Web development (2024, 6 months): HTML, CSS, JavaScript, web architecture</w:t>
+      </w:r>
+    </w:p>
+    <w:p>
+      <w:pPr>
+        <w:pStyle w:val="Compact"/>
+        <w:numPr>
+          <w:ilvl w:val="0"/>
+          <w:numId w:val="1009"/>
+        </w:numPr>
+      </w:pPr>
+      <w:r>
+        <w:t xml:space="preserve">Certificate: Google Ads Search Certification (Skillshop), December 2025, valid until 3 Dec 2026 – verifiable:</w:t>
       </w:r>
       <w:r>
         <w:t xml:space="preserve"> </w:t>
       </w:r>
-      <w:hyperlink r:id="rId19">
+      <w:hyperlink r:id="rId20">
         <w:r>
           <w:rPr>
             <w:rStyle w:val="Hyperlink"/>
@@ -567,16 +641,6 @@
         </w:r>
       </w:hyperlink>
     </w:p>
-    <w:bookmarkEnd w:id="20"/>
-    <w:bookmarkStart w:id="21" w:name="skills-used-in-projects"/>
-    <w:p>
-      <w:pPr>
-        <w:pStyle w:val="Heading2"/>
-      </w:pPr>
-      <w:r>
-        <w:t xml:space="preserve">Skills (used in projects)</w:t>
-      </w:r>
-    </w:p>
     <w:p>
       <w:pPr>
         <w:pStyle w:val="Compact"/>
@@ -586,7 +650,7 @@
         </w:numPr>
       </w:pPr>
       <w:r>
-        <w:t xml:space="preserve">Development: Python, FastAPI, TypeScript, React, Next.js, React Native</w:t>
+        <w:t xml:space="preserve">Languages: German (native) · English (B1, working towards B2) · Polish (spoken)</w:t>
       </w:r>
     </w:p>
     <w:p>
@@ -598,81 +662,11 @@
         </w:numPr>
       </w:pPr>
       <w:r>
-        <w:t xml:space="preserve">AI &amp; agents: Claude Code, LLM APIs (Claude, Gemini, Groq), MCP, agent orchestration, n8n</w:t>
-      </w:r>
-    </w:p>
-    <w:p>
-      <w:pPr>
-        <w:pStyle w:val="Compact"/>
-        <w:numPr>
-          <w:ilvl w:val="0"/>
-          <w:numId w:val="1009"/>
-        </w:numPr>
-      </w:pPr>
-      <w:r>
-        <w:t xml:space="preserve">Data &amp; jobs: PostgreSQL, SQLAlchemy/Alembic, Celery, Redis, Supabase</w:t>
-      </w:r>
-    </w:p>
-    <w:p>
-      <w:pPr>
-        <w:pStyle w:val="Compact"/>
-        <w:numPr>
-          <w:ilvl w:val="0"/>
-          <w:numId w:val="1009"/>
-        </w:numPr>
-      </w:pPr>
-      <w:r>
-        <w:t xml:space="preserve">Quality: pytest, Vitest, Playwright, GitHub Actions, Lighthouse CI</w:t>
-      </w:r>
-    </w:p>
-    <w:p>
-      <w:pPr>
-        <w:pStyle w:val="Compact"/>
-        <w:numPr>
-          <w:ilvl w:val="0"/>
-          <w:numId w:val="1009"/>
-        </w:numPr>
-      </w:pPr>
-      <w:r>
-        <w:t xml:space="preserve">Operations: Linux servers, Docker Compose, cron, flock, SMTP/IMAP, SPF/DKIM</w:t>
-      </w:r>
-    </w:p>
-    <w:p>
-      <w:pPr>
-        <w:pStyle w:val="Compact"/>
-        <w:numPr>
-          <w:ilvl w:val="0"/>
-          <w:numId w:val="1009"/>
-        </w:numPr>
-      </w:pPr>
-      <w:r>
-        <w:t xml:space="preserve">Web &amp; commerce: Shopify Liquid, Tailwind, GSAP, PWA, Canvas/WebGL</w:t>
+        <w:t xml:space="preserve">Remote work: Distributed teamwork via GitHub (branches, pull requests), Discord and online calls</w:t>
       </w:r>
     </w:p>
     <w:bookmarkEnd w:id="21"/>
-    <w:bookmarkStart w:id="22" w:name="languages"/>
-    <w:p>
-      <w:pPr>
-        <w:pStyle w:val="Heading2"/>
-      </w:pPr>
-      <w:r>
-        <w:t xml:space="preserve">Languages</w:t>
-      </w:r>
-    </w:p>
-    <w:p>
-      <w:pPr>
-        <w:pStyle w:val="Compact"/>
-        <w:numPr>
-          <w:ilvl w:val="0"/>
-          <w:numId w:val="1010"/>
-        </w:numPr>
-      </w:pPr>
-      <w:r>
-        <w:t xml:space="preserve">German: native · English: B1, working towards B2 · Polish: spoken</w:t>
-      </w:r>
-    </w:p>
     <w:bookmarkEnd w:id="22"/>
-    <w:bookmarkEnd w:id="23"/>
     <w:sectPr>
       <w:footnotePr>
         <w:numRestart w:val="eachSect"/>
@@ -914,9 +908,6 @@
     <w:abstractNumId w:val="991"/>
   </w:num>
   <w:num w:numId="1009">
-    <w:abstractNumId w:val="991"/>
-  </w:num>
-  <w:num w:numId="1010">
     <w:abstractNumId w:val="991"/>
   </w:num>
 </w:numbering>

</xml_diff>